<commit_message>
Add documented screenshots with captions to Word documentation
Co-authored-by: Dudzinska <Dudzinska@users.noreply.github.com>
</commit_message>
<xml_diff>
--- a/docs/Dokumentacja_BillsBuddy_Klaudia_Dudzinska.docx
+++ b/docs/Dokumentacja_BillsBuddy_Klaudia_Dudzinska.docx
@@ -778,35 +778,144 @@
       </w:r>
     </w:p>
     <w:p>
-      <w:pPr>
-        <w:pStyle w:val="ListBullet"/>
-      </w:pPr>
       <w:r>
-        <w:t>Rysunek 1: Dashboard na desktopie.</w:t>
+        <w:drawing>
+          <wp:inline xmlns:a="http://schemas.openxmlformats.org/drawingml/2006/main" xmlns:pic="http://schemas.openxmlformats.org/drawingml/2006/picture">
+            <wp:extent cx="5669280" cy="3168127"/>
+            <wp:docPr id="2" name="Picture 2"/>
+            <wp:cNvGraphicFramePr>
+              <a:graphicFrameLocks noChangeAspect="1"/>
+            </wp:cNvGraphicFramePr>
+            <a:graphic>
+              <a:graphicData uri="http://schemas.openxmlformats.org/drawingml/2006/picture">
+                <pic:pic>
+                  <pic:nvPicPr>
+                    <pic:cNvPr id="0" name="screen_01_dashboard.png"/>
+                    <pic:cNvPicPr/>
+                  </pic:nvPicPr>
+                  <pic:blipFill>
+                    <a:blip r:embed="rId10"/>
+                    <a:stretch>
+                      <a:fillRect/>
+                    </a:stretch>
+                  </pic:blipFill>
+                  <pic:spPr>
+                    <a:xfrm>
+                      <a:off x="0" y="0"/>
+                      <a:ext cx="5669280" cy="3168127"/>
+                    </a:xfrm>
+                    <a:prstGeom prst="rect"/>
+                  </pic:spPr>
+                </pic:pic>
+              </a:graphicData>
+            </a:graphic>
+          </wp:inline>
+        </w:drawing>
       </w:r>
     </w:p>
     <w:p>
       <w:pPr>
-        <w:pStyle w:val="ListBullet"/>
+        <w:jc w:val="center"/>
       </w:pPr>
       <w:r>
-        <w:t>Rysunek 2: Formularz CRUD na desktopie.</w:t>
+        <w:rPr>
+          <w:i/>
+        </w:rPr>
+        <w:t>Rysunek 1. Dashboard aplikacji BillsBuddy (widok desktop) — podsumowanie danych i wejście do głównych funkcji.</w:t>
+      </w:r>
+    </w:p>
+    <w:p>
+      <w:r>
+        <w:drawing>
+          <wp:inline xmlns:a="http://schemas.openxmlformats.org/drawingml/2006/main" xmlns:pic="http://schemas.openxmlformats.org/drawingml/2006/picture">
+            <wp:extent cx="5669280" cy="3168127"/>
+            <wp:docPr id="3" name="Picture 3"/>
+            <wp:cNvGraphicFramePr>
+              <a:graphicFrameLocks noChangeAspect="1"/>
+            </wp:cNvGraphicFramePr>
+            <a:graphic>
+              <a:graphicData uri="http://schemas.openxmlformats.org/drawingml/2006/picture">
+                <pic:pic>
+                  <pic:nvPicPr>
+                    <pic:cNvPr id="0" name="screen_02_groups_crud.png"/>
+                    <pic:cNvPicPr/>
+                  </pic:nvPicPr>
+                  <pic:blipFill>
+                    <a:blip r:embed="rId11"/>
+                    <a:stretch>
+                      <a:fillRect/>
+                    </a:stretch>
+                  </pic:blipFill>
+                  <pic:spPr>
+                    <a:xfrm>
+                      <a:off x="0" y="0"/>
+                      <a:ext cx="5669280" cy="3168127"/>
+                    </a:xfrm>
+                    <a:prstGeom prst="rect"/>
+                  </pic:spPr>
+                </pic:pic>
+              </a:graphicData>
+            </a:graphic>
+          </wp:inline>
+        </w:drawing>
       </w:r>
     </w:p>
     <w:p>
       <w:pPr>
-        <w:pStyle w:val="ListBullet"/>
+        <w:jc w:val="center"/>
       </w:pPr>
       <w:r>
-        <w:t>Rysunek 3: Widok mobilny menu i listy danych.</w:t>
+        <w:rPr>
+          <w:i/>
+        </w:rPr>
+        <w:t>Rysunek 2. CRUD grup (widok desktop) — tworzenie, filtrowanie, edycja i usuwanie zasobów.</w:t>
+      </w:r>
+    </w:p>
+    <w:p>
+      <w:r>
+        <w:drawing>
+          <wp:inline xmlns:a="http://schemas.openxmlformats.org/drawingml/2006/main" xmlns:pic="http://schemas.openxmlformats.org/drawingml/2006/picture">
+            <wp:extent cx="2926080" cy="5201920"/>
+            <wp:docPr id="4" name="Picture 4"/>
+            <wp:cNvGraphicFramePr>
+              <a:graphicFrameLocks noChangeAspect="1"/>
+            </wp:cNvGraphicFramePr>
+            <a:graphic>
+              <a:graphicData uri="http://schemas.openxmlformats.org/drawingml/2006/picture">
+                <pic:pic>
+                  <pic:nvPicPr>
+                    <pic:cNvPr id="0" name="screen_06_mobile_view.png"/>
+                    <pic:cNvPicPr/>
+                  </pic:nvPicPr>
+                  <pic:blipFill>
+                    <a:blip r:embed="rId12"/>
+                    <a:stretch>
+                      <a:fillRect/>
+                    </a:stretch>
+                  </pic:blipFill>
+                  <pic:spPr>
+                    <a:xfrm>
+                      <a:off x="0" y="0"/>
+                      <a:ext cx="2926080" cy="5201920"/>
+                    </a:xfrm>
+                    <a:prstGeom prst="rect"/>
+                  </pic:spPr>
+                </pic:pic>
+              </a:graphicData>
+            </a:graphic>
+          </wp:inline>
+        </w:drawing>
       </w:r>
     </w:p>
     <w:p>
       <w:pPr>
-        <w:pStyle w:val="ListBullet"/>
+        <w:jc w:val="center"/>
       </w:pPr>
       <w:r>
-        <w:t>Każdy zrzut powinien mieć podpis: co przedstawia i jaki krok procesu dokumentuje.</w:t>
+        <w:rPr>
+          <w:i/>
+        </w:rPr>
+        <w:t>Rysunek 3. Widok responsywny (mobile) — menu i sekcje dopasowane do mniejszych ekranów.</w:t>
       </w:r>
     </w:p>
     <w:p>
@@ -999,6 +1108,53 @@
       </w:r>
     </w:p>
     <w:p>
+      <w:r>
+        <w:drawing>
+          <wp:inline xmlns:a="http://schemas.openxmlformats.org/drawingml/2006/main" xmlns:pic="http://schemas.openxmlformats.org/drawingml/2006/picture">
+            <wp:extent cx="5669280" cy="3168127"/>
+            <wp:docPr id="5" name="Picture 5"/>
+            <wp:cNvGraphicFramePr>
+              <a:graphicFrameLocks noChangeAspect="1"/>
+            </wp:cNvGraphicFramePr>
+            <a:graphic>
+              <a:graphicData uri="http://schemas.openxmlformats.org/drawingml/2006/picture">
+                <pic:pic>
+                  <pic:nvPicPr>
+                    <pic:cNvPr id="0" name="screen_03_admin_panel.png"/>
+                    <pic:cNvPicPr/>
+                  </pic:nvPicPr>
+                  <pic:blipFill>
+                    <a:blip r:embed="rId13"/>
+                    <a:stretch>
+                      <a:fillRect/>
+                    </a:stretch>
+                  </pic:blipFill>
+                  <pic:spPr>
+                    <a:xfrm>
+                      <a:off x="0" y="0"/>
+                      <a:ext cx="5669280" cy="3168127"/>
+                    </a:xfrm>
+                    <a:prstGeom prst="rect"/>
+                  </pic:spPr>
+                </pic:pic>
+              </a:graphicData>
+            </a:graphic>
+          </wp:inline>
+        </w:drawing>
+      </w:r>
+    </w:p>
+    <w:p>
+      <w:pPr>
+        <w:jc w:val="center"/>
+      </w:pPr>
+      <w:r>
+        <w:rPr>
+          <w:i/>
+        </w:rPr>
+        <w:t>Rysunek 4. Panel administratora — zarządzanie profilami użytkowników, rolami i uprawnieniami.</w:t>
+      </w:r>
+    </w:p>
+    <w:p>
       <w:pPr>
         <w:pStyle w:val="Heading2"/>
       </w:pPr>
@@ -1137,6 +1293,100 @@
     <w:p>
       <w:r>
         <w:t>Po dodaniu rachunku i pozycji z paragonu system automatycznie oblicza udziały członków grupy, aktualizuje bilans i generuje listę spłat „kto komu i ile oddaje”. Dodatkowo obsługuje sytuację, gdy suma pozycji paragonu jest różna od kwoty rachunku.</w:t>
+      </w:r>
+    </w:p>
+    <w:p>
+      <w:r>
+        <w:drawing>
+          <wp:inline xmlns:a="http://schemas.openxmlformats.org/drawingml/2006/main" xmlns:pic="http://schemas.openxmlformats.org/drawingml/2006/picture">
+            <wp:extent cx="5669280" cy="3168127"/>
+            <wp:docPr id="6" name="Picture 6"/>
+            <wp:cNvGraphicFramePr>
+              <a:graphicFrameLocks noChangeAspect="1"/>
+            </wp:cNvGraphicFramePr>
+            <a:graphic>
+              <a:graphicData uri="http://schemas.openxmlformats.org/drawingml/2006/picture">
+                <pic:pic>
+                  <pic:nvPicPr>
+                    <pic:cNvPr id="0" name="screen_04_settlement.png"/>
+                    <pic:cNvPicPr/>
+                  </pic:nvPicPr>
+                  <pic:blipFill>
+                    <a:blip r:embed="rId14"/>
+                    <a:stretch>
+                      <a:fillRect/>
+                    </a:stretch>
+                  </pic:blipFill>
+                  <pic:spPr>
+                    <a:xfrm>
+                      <a:off x="0" y="0"/>
+                      <a:ext cx="5669280" cy="3168127"/>
+                    </a:xfrm>
+                    <a:prstGeom prst="rect"/>
+                  </pic:spPr>
+                </pic:pic>
+              </a:graphicData>
+            </a:graphic>
+          </wp:inline>
+        </w:drawing>
+      </w:r>
+    </w:p>
+    <w:p>
+      <w:pPr>
+        <w:jc w:val="center"/>
+      </w:pPr>
+      <w:r>
+        <w:rPr>
+          <w:i/>
+        </w:rPr>
+        <w:t>Rysunek 5. Mechanizm rozliczeń — bilans grupy, historia rachunków i komunikaty „kto komu i ile oddaje”.</w:t>
+      </w:r>
+    </w:p>
+    <w:p>
+      <w:r>
+        <w:drawing>
+          <wp:inline xmlns:a="http://schemas.openxmlformats.org/drawingml/2006/main" xmlns:pic="http://schemas.openxmlformats.org/drawingml/2006/picture">
+            <wp:extent cx="5669280" cy="3168127"/>
+            <wp:docPr id="7" name="Picture 7"/>
+            <wp:cNvGraphicFramePr>
+              <a:graphicFrameLocks noChangeAspect="1"/>
+            </wp:cNvGraphicFramePr>
+            <a:graphic>
+              <a:graphicData uri="http://schemas.openxmlformats.org/drawingml/2006/picture">
+                <pic:pic>
+                  <pic:nvPicPr>
+                    <pic:cNvPr id="0" name="screen_05_public_catalog.png"/>
+                    <pic:cNvPicPr/>
+                  </pic:nvPicPr>
+                  <pic:blipFill>
+                    <a:blip r:embed="rId15"/>
+                    <a:stretch>
+                      <a:fillRect/>
+                    </a:stretch>
+                  </pic:blipFill>
+                  <pic:spPr>
+                    <a:xfrm>
+                      <a:off x="0" y="0"/>
+                      <a:ext cx="5669280" cy="3168127"/>
+                    </a:xfrm>
+                    <a:prstGeom prst="rect"/>
+                  </pic:spPr>
+                </pic:pic>
+              </a:graphicData>
+            </a:graphic>
+          </wp:inline>
+        </w:drawing>
+      </w:r>
+    </w:p>
+    <w:p>
+      <w:pPr>
+        <w:jc w:val="center"/>
+      </w:pPr>
+      <w:r>
+        <w:rPr>
+          <w:i/>
+        </w:rPr>
+        <w:t>Rysunek 6. Katalog publiczny (read-only) dla użytkownika niezalogowanego.</w:t>
       </w:r>
     </w:p>
     <w:p>

</xml_diff>

<commit_message>
Use official UR logo and strengthen docs against IA template
Co-authored-by: Dudzinska <Dudzinska@users.noreply.github.com>
</commit_message>
<xml_diff>
--- a/docs/Dokumentacja_BillsBuddy_Klaudia_Dudzinska.docx
+++ b/docs/Dokumentacja_BillsBuddy_Klaudia_Dudzinska.docx
@@ -6,7 +6,7 @@
       <w:r>
         <w:drawing>
           <wp:inline xmlns:a="http://schemas.openxmlformats.org/drawingml/2006/main" xmlns:pic="http://schemas.openxmlformats.org/drawingml/2006/picture">
-            <wp:extent cx="5303520" cy="1885696"/>
+            <wp:extent cx="5303520" cy="2983230"/>
             <wp:docPr id="1" name="Picture 1"/>
             <wp:cNvGraphicFramePr>
               <a:graphicFrameLocks noChangeAspect="1"/>
@@ -15,7 +15,7 @@
               <a:graphicData uri="http://schemas.openxmlformats.org/drawingml/2006/picture">
                 <pic:pic>
                   <pic:nvPicPr>
-                    <pic:cNvPr id="0" name="logo_ur.png"/>
+                    <pic:cNvPr id="0" name="logo_ur_official.png"/>
                     <pic:cNvPicPr/>
                   </pic:nvPicPr>
                   <pic:blipFill>
@@ -27,7 +27,7 @@
                   <pic:spPr>
                     <a:xfrm>
                       <a:off x="0" y="0"/>
-                      <a:ext cx="5303520" cy="1885696"/>
+                      <a:ext cx="5303520" cy="2983230"/>
                     </a:xfrm>
                     <a:prstGeom prst="rect"/>
                   </pic:spPr>
@@ -93,6 +93,18 @@
       </w:r>
     </w:p>
     <w:p>
+      <w:pPr>
+        <w:jc w:val="center"/>
+      </w:pPr>
+      <w:r>
+        <w:rPr>
+          <w:i/>
+          <w:sz w:val="18"/>
+        </w:rPr>
+        <w:t>Logo UR — źródło: https://www.ur.edu.pl/pl/uniwersytet/aktualnosci/logo-uniwersytetu-rzeszowskiego,20638</w:t>
+      </w:r>
+    </w:p>
+    <w:p>
       <w:r>
         <w:br w:type="page"/>
       </w:r>
@@ -103,6 +115,14 @@
       </w:pPr>
       <w:r>
         <w:t>Autor dokumentacji: Klaudia Dudzińska</w:t>
+      </w:r>
+    </w:p>
+    <w:p>
+      <w:pPr>
+        <w:pStyle w:val="Heading1"/>
+      </w:pPr>
+      <w:r>
+        <w:t>Instrukcja uruchomienia projektu</w:t>
       </w:r>
     </w:p>
     <w:p>
@@ -132,6 +152,38 @@
       </w:pPr>
       <w:r>
         <w:t>Czym się wyróżnia? Automatycznym podziałem kosztów, przejrzystym bilansem oraz planem spłat.</w:t>
+      </w:r>
+    </w:p>
+    <w:p>
+      <w:pPr>
+        <w:pStyle w:val="Heading1"/>
+      </w:pPr>
+      <w:r>
+        <w:t>Mapa spełnienia wymagań IA</w:t>
+      </w:r>
+    </w:p>
+    <w:p>
+      <w:pPr>
+        <w:pStyle w:val="ListBullet"/>
+      </w:pPr>
+      <w:r>
+        <w:t>Ocena 3.0: CRUD zasobów + walidacje + relacje + panel administratora.</w:t>
+      </w:r>
+    </w:p>
+    <w:p>
+      <w:pPr>
+        <w:pStyle w:val="ListBullet"/>
+      </w:pPr>
+      <w:r>
+        <w:t>Ocena 4.0: role i uprawnienia, zarządzanie zasobami, zarządzanie profilami przez administratora, dostęp read-only dla niezalogowanego.</w:t>
+      </w:r>
+    </w:p>
+    <w:p>
+      <w:pPr>
+        <w:pStyle w:val="ListBullet"/>
+      </w:pPr>
+      <w:r>
+        <w:t>Ocena 5.0: logika biznesowa rozliczeń (bilans i plan spłat) oraz funkcje ponad prosty CRUD.</w:t>
       </w:r>
     </w:p>
     <w:p>
@@ -1021,6 +1073,14 @@
     </w:p>
     <w:p>
       <w:pPr>
+        <w:pStyle w:val="ListBullet"/>
+      </w:pPr>
+      <w:r>
+        <w:t>Formularz jest podzielony logicznie na sekcje, aby prowadzić użytkownika krok po kroku.</w:t>
+      </w:r>
+    </w:p>
+    <w:p>
+      <w:pPr>
         <w:pStyle w:val="Heading3"/>
       </w:pPr>
       <w:r>
@@ -1053,6 +1113,14 @@
     </w:p>
     <w:p>
       <w:pPr>
+        <w:pStyle w:val="ListBullet"/>
+      </w:pPr>
+      <w:r>
+        <w:t>Podejście analogiczne do zaawansowanych filtrów marketplace: użytkownik nie przegląda ręcznie całej listy.</w:t>
+      </w:r>
+    </w:p>
+    <w:p>
+      <w:pPr>
         <w:pStyle w:val="Heading3"/>
       </w:pPr>
       <w:r>
@@ -1077,6 +1145,14 @@
     </w:p>
     <w:p>
       <w:pPr>
+        <w:pStyle w:val="ListBullet"/>
+      </w:pPr>
+      <w:r>
+        <w:t>Dostęp do edycji jest kontrolowany autoryzacją właściciel/admin.</w:t>
+      </w:r>
+    </w:p>
+    <w:p>
+      <w:pPr>
         <w:pStyle w:val="Heading3"/>
       </w:pPr>
       <w:r>
@@ -1105,6 +1181,14 @@
       </w:pPr>
       <w:r>
         <w:t>Autoryzacja serwerowa zabezpiecza usuwanie tylko dla uprawnionych.</w:t>
+      </w:r>
+    </w:p>
+    <w:p>
+      <w:pPr>
+        <w:pStyle w:val="ListBullet"/>
+      </w:pPr>
+      <w:r>
+        <w:t>Usunięcie jest wykonywane przez kontroler po walidacji kontekstu zasobu.</w:t>
       </w:r>
     </w:p>
     <w:p>
@@ -1440,6 +1524,756 @@
     <w:p>
       <w:r>
         <w:t>Pełny zestaw odpowiedzi znajduje się w aplikacji pod ścieżką /pytania-projektowe oraz w pliku docs/project_questions_answers.md.</w:t>
+      </w:r>
+    </w:p>
+    <w:p>
+      <w:pPr>
+        <w:pStyle w:val="Heading1"/>
+      </w:pPr>
+      <w:r>
+        <w:t>Załącznik: pełne odpowiedzi na pytania 3.0 i 4.0</w:t>
+      </w:r>
+    </w:p>
+    <w:p>
+      <w:pPr>
+        <w:pStyle w:val="Heading2"/>
+      </w:pPr>
+      <w:r>
+        <w:t>Pytania do projektu – odpowiedzi (ocena 3.0 i 4.0)</w:t>
+      </w:r>
+    </w:p>
+    <w:p>
+      <w:r>
+        <w:t>Źródło pytań i kryteriów: https://ia.lazysolutions.pl/project_requirements.html</w:t>
+      </w:r>
+    </w:p>
+    <w:p>
+      <w:r>
+        <w:t>&gt; Kontekst projektu: BillsBuddy (Laravel), aplikacja do rozliczania wspólnych wydatków.</w:t>
+      </w:r>
+    </w:p>
+    <w:p>
+      <w:pPr>
+        <w:pStyle w:val="Heading3"/>
+      </w:pPr>
+      <w:r>
+        <w:t>Pytania na ocenę 3.0</w:t>
+      </w:r>
+    </w:p>
+    <w:p>
+      <w:pPr>
+        <w:pStyle w:val="Heading4"/>
+      </w:pPr>
+      <w:r>
+        <w:t>1. Opisz działanie protokołu HTTP.</w:t>
+      </w:r>
+    </w:p>
+    <w:p>
+      <w:r>
+        <w:t>HTTP to protokół komunikacji klient-serwer używany w WWW. Przeglądarka wysyła żądanie (request), serwer zwraca odpowiedź (response). Każde żądanie jest niezależne i zawiera wszystkie informacje potrzebne do jego obsługi.</w:t>
+      </w:r>
+    </w:p>
+    <w:p>
+      <w:pPr>
+        <w:pStyle w:val="Heading4"/>
+      </w:pPr>
+      <w:r>
+        <w:t>2. Czym różni się HTTP od HTTPS?</w:t>
+      </w:r>
+    </w:p>
+    <w:p>
+      <w:r>
+        <w:t>HTTPS to HTTP działające przez TLS/SSL. W HTTPS dane są szyfrowane, zapewniona jest integralność i weryfikacja certyfikatu serwera. HTTP nie szyfruje ruchu i jest podatne na podsłuch oraz modyfikację.</w:t>
+      </w:r>
+    </w:p>
+    <w:p>
+      <w:pPr>
+        <w:pStyle w:val="Heading4"/>
+      </w:pPr>
+      <w:r>
+        <w:t>3. Jak zbudowane jest żądanie HTTP?</w:t>
+      </w:r>
+    </w:p>
+    <w:p>
+      <w:r>
+        <w:t>Żądanie zawiera: linię startową (metoda, ścieżka, wersja), nagłówki, pustą linię oraz opcjonalne body. Przykład: `POST /groups HTTP/1.1`, nagłówki `Host`, `Content-Type`, `Cookie`, a body np. JSON lub dane formularza.</w:t>
+      </w:r>
+    </w:p>
+    <w:p>
+      <w:pPr>
+        <w:pStyle w:val="Heading4"/>
+      </w:pPr>
+      <w:r>
+        <w:t>4. Jak zbudowana jest odpowiedź HTTP?</w:t>
+      </w:r>
+    </w:p>
+    <w:p>
+      <w:r>
+        <w:t>Odpowiedź ma linię statusu (np. `HTTP/1.1 200 OK`), nagłówki, pustą linię i body (HTML/JSON/itp.). Status mówi o wyniku operacji, nagłówki określają metadane odpowiedzi.</w:t>
+      </w:r>
+    </w:p>
+    <w:p>
+      <w:pPr>
+        <w:pStyle w:val="Heading4"/>
+      </w:pPr>
+      <w:r>
+        <w:t>5. Jak obsługiwane są żądania HTTP w projekcie Laravel?</w:t>
+      </w:r>
+    </w:p>
+    <w:p>
+      <w:r>
+        <w:t>Ruch trafia przez `public/index.php` do kernela aplikacji. Laravel dopasowuje route z `routes/web.php`, uruchamia middleware, a potem odpowiedni kontroler/metodę (lub closure). Wynik to widok Blade albo redirect/JSON.</w:t>
+      </w:r>
+    </w:p>
+    <w:p>
+      <w:pPr>
+        <w:pStyle w:val="Heading4"/>
+      </w:pPr>
+      <w:r>
+        <w:t>6. Jakie są metody HTTP?</w:t>
+      </w:r>
+    </w:p>
+    <w:p>
+      <w:r>
+        <w:t>Najczęściej: GET, POST, PUT, PATCH, DELETE, HEAD, OPTIONS. W API spotyka się też TRACE/CONNECT, ale rzadziej w aplikacjach webowych.</w:t>
+      </w:r>
+    </w:p>
+    <w:p>
+      <w:pPr>
+        <w:pStyle w:val="Heading4"/>
+      </w:pPr>
+      <w:r>
+        <w:t>7. Jakie są kody odpowiedzi HTTP?</w:t>
+      </w:r>
+    </w:p>
+    <w:p>
+      <w:r>
+        <w:t>Grupy kodów: 1xx informacyjne, 2xx sukces, 3xx przekierowania, 4xx błędy klienta, 5xx błędy serwera. Przykłady: 200 OK, 201 Created, 302 Found, 403 Forbidden, 404 Not Found, 422 Unprocessable Entity, 500 Internal Server Error.</w:t>
+      </w:r>
+    </w:p>
+    <w:p>
+      <w:pPr>
+        <w:pStyle w:val="Heading4"/>
+      </w:pPr>
+      <w:r>
+        <w:t>8. Jakie są nagłówki HTTP?</w:t>
+      </w:r>
+    </w:p>
+    <w:p>
+      <w:r>
+        <w:t>To metadane żądania/odpowiedzi, np. `Host`, `Authorization`, `Content-Type`, `Accept`, `Cookie`, `Set-Cookie`, `Cache-Control`, `User-Agent`. Wpływają na autoryzację, format danych i cache.</w:t>
+      </w:r>
+    </w:p>
+    <w:p>
+      <w:pPr>
+        <w:pStyle w:val="Heading4"/>
+      </w:pPr>
+      <w:r>
+        <w:t>9. Jakie metody HTTP obsługuje domyślnie język HTML?</w:t>
+      </w:r>
+    </w:p>
+    <w:p>
+      <w:r>
+        <w:t>Formularze HTML wspierają natywnie tylko `GET` i `POST`.</w:t>
+      </w:r>
+    </w:p>
+    <w:p>
+      <w:pPr>
+        <w:pStyle w:val="Heading4"/>
+      </w:pPr>
+      <w:r>
+        <w:t>10. Jak obsługiwać pozostałe metody HTTP w Laravel, których HTML nie wspiera?</w:t>
+      </w:r>
+    </w:p>
+    <w:p>
+      <w:r>
+        <w:t>Używa się spoofingu metod: formularz wysyła `POST`, a Laravel dostaje ukrytą wartość metody przez `@method('PUT')`, `@method('PATCH')`, `@method('DELETE')`.</w:t>
+      </w:r>
+    </w:p>
+    <w:p>
+      <w:pPr>
+        <w:pStyle w:val="Heading4"/>
+      </w:pPr>
+      <w:r>
+        <w:t>11. Jakie znasz narzędzia do debugowania i testowania UI?</w:t>
+      </w:r>
+    </w:p>
+    <w:p>
+      <w:r>
+        <w:t>DevTools w przeglądarce (Elements, Responsive Mode), Lighthouse, Playwright/Cypress (testy E2E), testy manualne scenariuszy użytkownika.</w:t>
+      </w:r>
+    </w:p>
+    <w:p>
+      <w:pPr>
+        <w:pStyle w:val="Heading4"/>
+      </w:pPr>
+      <w:r>
+        <w:t>12. Jakie znasz narzędzia do debugowania HTTP/JavaScript?</w:t>
+      </w:r>
+    </w:p>
+    <w:p>
+      <w:r>
+        <w:t>Network tab w DevTools, Postman/Insomnia, curl, logi JS w Console, source maps, debugger w VS Code/Chrome.</w:t>
+      </w:r>
+    </w:p>
+    <w:p>
+      <w:pPr>
+        <w:pStyle w:val="Heading4"/>
+      </w:pPr>
+      <w:r>
+        <w:t>13. Jakie znasz narzędzia do debugowania bazy danych?</w:t>
+      </w:r>
+    </w:p>
+    <w:p>
+      <w:r>
+        <w:t>phpMyAdmin/DB client (MySQL), sqlitebrowser (SQLite), Laravel Query Log, `php artisan tinker`, logi SQL (np. Telescope/Debugbar – jeśli użyte).</w:t>
+      </w:r>
+    </w:p>
+    <w:p>
+      <w:pPr>
+        <w:pStyle w:val="Heading4"/>
+      </w:pPr>
+      <w:r>
+        <w:t>14. Opisz drogę instrukcji po wpisaniu adresu strony i Enter.</w:t>
+      </w:r>
+    </w:p>
+    <w:p>
+      <w:r>
+        <w:t>Przeglądarka wysyła request GET do serwera. Laravel ładuje aplikację, route jest dopasowany, middleware sprawdza dostęp, kontroler/closure pobiera dane, renderuje widok Blade, a serwer odsyła HTML do przeglądarki.</w:t>
+      </w:r>
+    </w:p>
+    <w:p>
+      <w:pPr>
+        <w:pStyle w:val="Heading4"/>
+      </w:pPr>
+      <w:r>
+        <w:t>15. Opisz drogę instrukcji po kliknięciu „dodaj/usuń/edytuj” w formularzu.</w:t>
+      </w:r>
+    </w:p>
+    <w:p>
+      <w:r>
+        <w:t>Formularz wysyła request (POST/DELETE/PATCH przez spoofing). Laravel przechodzi przez middleware i walidację, kontroler wykonuje operację na modelu/bazie, po czym zwraca redirect z komunikatem sukcesu lub błędami walidacji.</w:t>
+      </w:r>
+    </w:p>
+    <w:p>
+      <w:pPr>
+        <w:pStyle w:val="Heading4"/>
+      </w:pPr>
+      <w:r>
+        <w:t>16. Czym różni się GET od POST?</w:t>
+      </w:r>
+    </w:p>
+    <w:p>
+      <w:r>
+        <w:t>GET służy do pobierania danych i parametry ma zwykle w URL. POST służy do tworzenia/wywołania operacji z body żądania; nie powinien być używany do bezpiecznego cache’owanego odczytu.</w:t>
+      </w:r>
+    </w:p>
+    <w:p>
+      <w:pPr>
+        <w:pStyle w:val="Heading4"/>
+      </w:pPr>
+      <w:r>
+        <w:t>17. Do czego wykorzystujemy poszczególne metody HTTP?</w:t>
+      </w:r>
+    </w:p>
+    <w:p>
+      <w:r>
+        <w:t>GET – odczyt, POST – tworzenie, PUT – pełna aktualizacja, PATCH – częściowa aktualizacja, DELETE – usuwanie, HEAD – nagłówki bez body, OPTIONS – informacje o dozwolonych metodach.</w:t>
+      </w:r>
+    </w:p>
+    <w:p>
+      <w:pPr>
+        <w:pStyle w:val="Heading4"/>
+      </w:pPr>
+      <w:r>
+        <w:t>18. W jaki sposób działa walidacja po stronie frontendu?</w:t>
+      </w:r>
+    </w:p>
+    <w:p>
+      <w:r>
+        <w:t>Przez typy pól HTML (`type="email"`, `required`, `min`, `step`) oraz dodatkowy JavaScript. Ma poprawiać UX, ale nie zastępuje walidacji serwerowej.</w:t>
+      </w:r>
+    </w:p>
+    <w:p>
+      <w:pPr>
+        <w:pStyle w:val="Heading4"/>
+      </w:pPr>
+      <w:r>
+        <w:t>19. W jaki sposób działa walidacja po stronie serwera Laravel?</w:t>
+      </w:r>
+    </w:p>
+    <w:p>
+      <w:r>
+        <w:t>Kontroler (lub FormRequest) definiuje reguły walidacji. Gdy dane są błędne, Laravel zwraca redirect z błędami do sesji i old input; gdy poprawne – kod przechodzi do zapisu.</w:t>
+      </w:r>
+    </w:p>
+    <w:p>
+      <w:pPr>
+        <w:pStyle w:val="Heading4"/>
+      </w:pPr>
+      <w:r>
+        <w:t>20. Czym są migracje i jak je tworzyć?</w:t>
+      </w:r>
+    </w:p>
+    <w:p>
+      <w:r>
+        <w:t>Migracje to wersjonowanie schematu bazy danych. Tworzy się je przez `php artisan make:migration`, a uruchamia przez `php artisan migrate`.</w:t>
+      </w:r>
+    </w:p>
+    <w:p>
+      <w:r>
+        <w:t>Przykład:</w:t>
+      </w:r>
+    </w:p>
+    <w:p>
+      <w:r>
+        <w:t>```php</w:t>
+      </w:r>
+    </w:p>
+    <w:p>
+      <w:r>
+        <w:t>Schema::create('subscriptions', function (Blueprint $table) {</w:t>
+      </w:r>
+    </w:p>
+    <w:p>
+      <w:r>
+        <w:t>$table-&gt;id();</w:t>
+      </w:r>
+    </w:p>
+    <w:p>
+      <w:r>
+        <w:t>$table-&gt;string('name');</w:t>
+      </w:r>
+    </w:p>
+    <w:p>
+      <w:r>
+        <w:t>$table-&gt;decimal('price', 10, 2);</w:t>
+      </w:r>
+    </w:p>
+    <w:p>
+      <w:r>
+        <w:t>$table-&gt;timestamps();</w:t>
+      </w:r>
+    </w:p>
+    <w:p>
+      <w:r>
+        <w:t>});</w:t>
+      </w:r>
+    </w:p>
+    <w:p>
+      <w:r>
+        <w:t>```</w:t>
+      </w:r>
+    </w:p>
+    <w:p>
+      <w:pPr>
+        <w:pStyle w:val="Heading4"/>
+      </w:pPr>
+      <w:r>
+        <w:t>21. Czym są seedery i jak je tworzyć?</w:t>
+      </w:r>
+    </w:p>
+    <w:p>
+      <w:r>
+        <w:t>Seedery służą do wstawiania danych początkowych/testowych. Tworzenie: `php artisan make:seeder`, uruchomienie: `php artisan db:seed` albo `migrate:fresh --seed`.</w:t>
+      </w:r>
+    </w:p>
+    <w:p>
+      <w:r>
+        <w:t>Przykład:</w:t>
+      </w:r>
+    </w:p>
+    <w:p>
+      <w:r>
+        <w:t>```php</w:t>
+      </w:r>
+    </w:p>
+    <w:p>
+      <w:r>
+        <w:t>User::factory()-&gt;create([</w:t>
+      </w:r>
+    </w:p>
+    <w:p>
+      <w:r>
+        <w:t>'name' =&gt; 'Admin',</w:t>
+      </w:r>
+    </w:p>
+    <w:p>
+      <w:r>
+        <w:t>'email' =&gt; 'admin@example.com',</w:t>
+      </w:r>
+    </w:p>
+    <w:p>
+      <w:r>
+        <w:t>'role' =&gt; 'admin',</w:t>
+      </w:r>
+    </w:p>
+    <w:p>
+      <w:r>
+        <w:t>]);</w:t>
+      </w:r>
+    </w:p>
+    <w:p>
+      <w:r>
+        <w:t>```</w:t>
+      </w:r>
+    </w:p>
+    <w:p>
+      <w:pPr>
+        <w:pStyle w:val="Heading4"/>
+      </w:pPr>
+      <w:r>
+        <w:t>22. Czym są kontrolery i jak je tworzyć?</w:t>
+      </w:r>
+    </w:p>
+    <w:p>
+      <w:r>
+        <w:t>Kontroler grupuje logikę obsługi requestów HTTP. Tworzenie: `php artisan make:controller GroupController`.</w:t>
+      </w:r>
+    </w:p>
+    <w:p>
+      <w:r>
+        <w:t>Przykład:</w:t>
+      </w:r>
+    </w:p>
+    <w:p>
+      <w:r>
+        <w:t>```php</w:t>
+      </w:r>
+    </w:p>
+    <w:p>
+      <w:r>
+        <w:t>public function index() {</w:t>
+      </w:r>
+    </w:p>
+    <w:p>
+      <w:r>
+        <w:t>$groups = Group::latest()-&gt;paginate();</w:t>
+      </w:r>
+    </w:p>
+    <w:p>
+      <w:r>
+        <w:t>return view('groups.index', compact('groups'));</w:t>
+      </w:r>
+    </w:p>
+    <w:p>
+      <w:r>
+        <w:t>}</w:t>
+      </w:r>
+    </w:p>
+    <w:p>
+      <w:r>
+        <w:t>```</w:t>
+      </w:r>
+    </w:p>
+    <w:p>
+      <w:pPr>
+        <w:pStyle w:val="Heading4"/>
+      </w:pPr>
+      <w:r>
+        <w:t>23. Czym są modele i jak je tworzyć?</w:t>
+      </w:r>
+    </w:p>
+    <w:p>
+      <w:r>
+        <w:t>Model Eloquent reprezentuje tabelę i logikę danych. Tworzenie: `php artisan make:model Group`.</w:t>
+      </w:r>
+    </w:p>
+    <w:p>
+      <w:r>
+        <w:t>Przykład:</w:t>
+      </w:r>
+    </w:p>
+    <w:p>
+      <w:r>
+        <w:t>```php</w:t>
+      </w:r>
+    </w:p>
+    <w:p>
+      <w:r>
+        <w:t>class Group extends Model {</w:t>
+      </w:r>
+    </w:p>
+    <w:p>
+      <w:r>
+        <w:t>protected $fillable = ['name', 'description', 'owner_id'];</w:t>
+      </w:r>
+    </w:p>
+    <w:p>
+      <w:r>
+        <w:t>}</w:t>
+      </w:r>
+    </w:p>
+    <w:p>
+      <w:r>
+        <w:t>```</w:t>
+      </w:r>
+    </w:p>
+    <w:p>
+      <w:pPr>
+        <w:pStyle w:val="Heading4"/>
+      </w:pPr>
+      <w:r>
+        <w:t>24. Czym są widoki i jak je tworzyć?</w:t>
+      </w:r>
+    </w:p>
+    <w:p>
+      <w:r>
+        <w:t>Widoki to szablony HTML (Blade) renderowane użytkownikowi. Tworzy się je jako pliki `.blade.php` w `resources/views`.</w:t>
+      </w:r>
+    </w:p>
+    <w:p>
+      <w:pPr>
+        <w:pStyle w:val="Heading4"/>
+      </w:pPr>
+      <w:r>
+        <w:t>25. Czym są routing i jak je tworzyć?</w:t>
+      </w:r>
+    </w:p>
+    <w:p>
+      <w:r>
+        <w:t>Routing mapuje URL + metodę HTTP na akcję aplikacji. Definiuje się je np. w `routes/web.php`.</w:t>
+      </w:r>
+    </w:p>
+    <w:p>
+      <w:r>
+        <w:t>Przykład:</w:t>
+      </w:r>
+    </w:p>
+    <w:p>
+      <w:r>
+        <w:t>```php</w:t>
+      </w:r>
+    </w:p>
+    <w:p>
+      <w:r>
+        <w:t>Route::get('/groups', [GroupController::class, 'index'])-&gt;name('groups.index');</w:t>
+      </w:r>
+    </w:p>
+    <w:p>
+      <w:r>
+        <w:t>```</w:t>
+      </w:r>
+    </w:p>
+    <w:p>
+      <w:pPr>
+        <w:pStyle w:val="Heading4"/>
+      </w:pPr>
+      <w:r>
+        <w:t>26. Jak zabezpieczyć route tylko dla administratora?</w:t>
+      </w:r>
+    </w:p>
+    <w:p>
+      <w:r>
+        <w:t>Przez middleware sprawdzający rolę użytkownika i przypięcie go do trasy/grupy tras, np. `Route::middleware('admin')-&gt;group(...)`.</w:t>
+      </w:r>
+    </w:p>
+    <w:p>
+      <w:pPr>
+        <w:pStyle w:val="Heading4"/>
+      </w:pPr>
+      <w:r>
+        <w:t>27. Czym jest CSRF Token i dlaczego jest wymagany?</w:t>
+      </w:r>
+    </w:p>
+    <w:p>
+      <w:r>
+        <w:t>To token chroniący przed atakami CSRF (fałszywe żądania z cudzej strony). Laravel weryfikuje token dla żądań modyfikujących dane, dlatego formularze mają `@csrf`.</w:t>
+      </w:r>
+    </w:p>
+    <w:p>
+      <w:pPr>
+        <w:pStyle w:val="Heading4"/>
+      </w:pPr>
+      <w:r>
+        <w:t>28. Sposoby wyświetlania zmiennych w Blade i ochrona XSS.</w:t>
+      </w:r>
+    </w:p>
+    <w:p>
+      <w:r>
+        <w:t>`{{ $var }}` – bezpieczne (escape HTML), `{!! $html !!}` – bez escape (tylko dla zaufanego HTML), `@json($var)` – bezpieczny JSON do JS. Ochrona XSS jest domyślnie przez escaping w `{{ }}`.</w:t>
+      </w:r>
+    </w:p>
+    <w:p>
+      <w:pPr>
+        <w:pStyle w:val="Heading4"/>
+      </w:pPr>
+      <w:r>
+        <w:t>29. Czym różni się Eloquent ORM od Query Buildera?</w:t>
+      </w:r>
+    </w:p>
+    <w:p>
+      <w:r>
+        <w:t>Eloquent operuje na modelach i relacjach (bardziej obiektowo). Query Builder operuje na zapytaniach SQL bez warstwy modeli (często prostszy i wydajny do specyficznych zapytań).</w:t>
+      </w:r>
+    </w:p>
+    <w:p>
+      <w:pPr>
+        <w:pStyle w:val="Heading4"/>
+      </w:pPr>
+      <w:r>
+        <w:t>30. Do czego służy plik .env i czemu nie trafia do repo?</w:t>
+      </w:r>
+    </w:p>
+    <w:p>
+      <w:r>
+        <w:t>`.env` trzyma konfigurację zależną od środowiska (DB, klucze, hasła). Nie powinien trafiać do Git, bo zawiera wrażliwe dane.</w:t>
+      </w:r>
+    </w:p>
+    <w:p>
+      <w:pPr>
+        <w:pStyle w:val="Heading4"/>
+      </w:pPr>
+      <w:r>
+        <w:t>31. Gdzie szukać logów aplikacji Laravel?</w:t>
+      </w:r>
+    </w:p>
+    <w:p>
+      <w:r>
+        <w:t>W `storage/logs/`, najczęściej plik `laravel.log`.</w:t>
+      </w:r>
+    </w:p>
+    <w:p>
+      <w:pPr>
+        <w:pStyle w:val="Heading4"/>
+      </w:pPr>
+      <w:r>
+        <w:t>32. HTTP jest bezstanowy – jak Laravel „pamięta” zalogowanego?</w:t>
+      </w:r>
+    </w:p>
+    <w:p>
+      <w:r>
+        <w:t>Przez sesję i cookie sesyjne. Po logowaniu identyfikator sesji jest przechowywany po stronie klienta (cookie), a dane sesji po stronie serwera.</w:t>
+      </w:r>
+    </w:p>
+    <w:p>
+      <w:pPr>
+        <w:pStyle w:val="Heading4"/>
+      </w:pPr>
+      <w:r>
+        <w:t>33. Jak przechowywać hasła i jaki mechanizm ma Laravel?</w:t>
+      </w:r>
+    </w:p>
+    <w:p>
+      <w:r>
+        <w:t>Hasła przechowuje się wyłącznie jako hash (nigdy plaintext). Laravel używa `Hash::make()` (bcrypt/argon) oraz `Hash::check()` do weryfikacji.</w:t>
+      </w:r>
+    </w:p>
+    <w:p>
+      <w:pPr>
+        <w:pStyle w:val="Heading3"/>
+      </w:pPr>
+      <w:r>
+        <w:t>Pytania na ocenę 4.0</w:t>
+      </w:r>
+    </w:p>
+    <w:p>
+      <w:pPr>
+        <w:pStyle w:val="Heading4"/>
+      </w:pPr>
+      <w:r>
+        <w:t>1. Jak zrealizowano rozróżnienie uprawnień admin/user?</w:t>
+      </w:r>
+    </w:p>
+    <w:p>
+      <w:r>
+        <w:t>W projekcie użyto pola `role` w modelu `User` oraz `AdminMiddleware` (alias `admin`). Trasy panelu admina są w grupie `Route::middleware('admin')`, a zwykły użytkownik nie ma do nich dostępu.</w:t>
+      </w:r>
+    </w:p>
+    <w:p>
+      <w:pPr>
+        <w:pStyle w:val="Heading4"/>
+      </w:pPr>
+      <w:r>
+        <w:t>2. Jak działają relacje i jak je wykorzystać w widoku?</w:t>
+      </w:r>
+    </w:p>
+    <w:p>
+      <w:r>
+        <w:t>Przykłady: `Group` ma wielu `Bill` (one-to-many), `Group` ma wielu `User` (many-to-many), `Bill` ma wielu `BillSplit`. W widoku używamy np. `$group-&gt;users`, `$bill-&gt;payer-&gt;name`, a dla wydajności stosujemy eager loading `with(...)`.</w:t>
+      </w:r>
+    </w:p>
+    <w:p>
+      <w:pPr>
+        <w:pStyle w:val="Heading4"/>
+      </w:pPr>
+      <w:r>
+        <w:t>3. Co to FormRequest i czemu warto?</w:t>
+      </w:r>
+    </w:p>
+    <w:p>
+      <w:r>
+        <w:t>To dedykowane klasy walidacji/autoryzacji requestu. Upraszczają kontrolery, porządkują reguły i pozwalają wielokrotnie używać tej samej walidacji.</w:t>
+      </w:r>
+    </w:p>
+    <w:p>
+      <w:pPr>
+        <w:pStyle w:val="Heading4"/>
+      </w:pPr>
+      <w:r>
+        <w:t>4. Jak działa Route Model Binding?</w:t>
+      </w:r>
+    </w:p>
+    <w:p>
+      <w:r>
+        <w:t>Laravel automatycznie podmienia parametr trasy na model, np. w metodzie `show(Group $group)` na podstawie `{group}` z URL. Jeśli rekord nie istnieje, zwraca 404.</w:t>
+      </w:r>
+    </w:p>
+    <w:p>
+      <w:pPr>
+        <w:pStyle w:val="Heading4"/>
+      </w:pPr>
+      <w:r>
+        <w:t>5. Jak zapewniono, że user edytuje/usuwa tylko własne zasoby?</w:t>
+      </w:r>
+    </w:p>
+    <w:p>
+      <w:r>
+        <w:t>W kontrolerach są warunki autoryzacyjne (np. właściciel grupy lub admin). Dla nieuprawnionych akcji zwracane jest 403.</w:t>
+      </w:r>
+    </w:p>
+    <w:p>
+      <w:pPr>
+        <w:pStyle w:val="Heading4"/>
+      </w:pPr>
+      <w:r>
+        <w:t>6. Jakie dyrektywy Blade użyto dla DRY?</w:t>
+      </w:r>
+    </w:p>
+    <w:p>
+      <w:r>
+        <w:t>W projekcie użyto m.in. komponentów i layoutów (`&lt;x-app-layout&gt;`, `&lt;x-input-error&gt;`), `@include`, `@auth`, `@if`, `@foreach`, `@csrf`, `@method`. To ogranicza duplikację i porządkuje widoki.</w:t>
+      </w:r>
+    </w:p>
+    <w:p>
+      <w:pPr>
+        <w:pStyle w:val="Heading4"/>
+      </w:pPr>
+      <w:r>
+        <w:t>7. Jak zrealizować upload plików w Laravel i symlink do storage?</w:t>
+      </w:r>
+    </w:p>
+    <w:p>
+      <w:r>
+        <w:t>Standardowo: walidacja pliku, zapis przez `Storage::putFile(...)` albo `$request-&gt;file(...)-&gt;store(...)`. Dla publicznego dostępu tworzy się link: `php artisan storage:link`.</w:t>
+      </w:r>
+    </w:p>
+    <w:p>
+      <w:r>
+        <w:t>W tym projekcie upload plików nie jest główną funkcją produkcyjną; mechanizm można dodać analogicznie (np. zdjęcia paragonów).</w:t>
+      </w:r>
+    </w:p>
+    <w:p>
+      <w:pPr>
+        <w:pStyle w:val="Heading4"/>
+      </w:pPr>
+      <w:r>
+        <w:t>8. Czym są Soft Deletes i kiedy są użyteczne?</w:t>
+      </w:r>
+    </w:p>
+    <w:p>
+      <w:r>
+        <w:t>Soft Deletes oznaczają logiczne usunięcie rekordu (kolumna `deleted_at`), bez fizycznego kasowania danych. Przydatne przy audycie, możliwości przywracania danych i bezpieczeństwie operacyjnym.</w:t>
       </w:r>
     </w:p>
     <w:sectPr>

</xml_diff>